<commit_message>
changed analyte identifier from _ to $
</commit_message>
<xml_diff>
--- a/user_guide/WORKBOOK_TEMPLATE user guide.docx
+++ b/user_guide/WORKBOOK_TEMPLATE user guide.docx
@@ -1,6 +1,6 @@
 
 <file path=word/document.xml><?xml version="1.0" encoding="utf-8"?>
-<w:document xmlns:wpc="http://schemas.microsoft.com/office/word/2010/wordprocessingCanvas" xmlns:cx="http://schemas.microsoft.com/office/drawing/2014/chartex" xmlns:cx1="http://schemas.microsoft.com/office/drawing/2015/9/8/chartex" xmlns:cx2="http://schemas.microsoft.com/office/drawing/2015/10/21/chartex" xmlns:cx3="http://schemas.microsoft.com/office/drawing/2016/5/9/chartex" xmlns:cx4="http://schemas.microsoft.com/office/drawing/2016/5/10/chartex" xmlns:cx5="http://schemas.microsoft.com/office/drawing/2016/5/11/chartex" xmlns:cx6="http://schemas.microsoft.com/office/drawing/2016/5/12/chartex" xmlns:cx7="http://schemas.microsoft.com/office/drawing/2016/5/13/chartex" xmlns:cx8="http://schemas.microsoft.com/office/drawing/2016/5/14/chartex" xmlns:mc="http://schemas.openxmlformats.org/markup-compatibility/2006" xmlns:aink="http://schemas.microsoft.com/office/drawing/2016/ink" xmlns:am3d="http://schemas.microsoft.com/office/drawing/2017/model3d" xmlns:o="urn:schemas-microsoft-com:office:office" xmlns:oel="http://schemas.microsoft.com/office/2019/extlst" xmlns:r="http://schemas.openxmlformats.org/officeDocument/2006/relationships" xmlns:m="http://schemas.openxmlformats.org/officeDocument/2006/math" xmlns:v="urn:schemas-microsoft-com:vml" xmlns:wp14="http://schemas.microsoft.com/office/word/2010/wordprocessingDrawing" xmlns:wp="http://schemas.openxmlformats.org/drawingml/2006/wordprocessingDrawing" xmlns:w10="urn:schemas-microsoft-com:office:word" xmlns:w="http://schemas.openxmlformats.org/wordprocessingml/2006/main" xmlns:w14="http://schemas.microsoft.com/office/word/2010/wordml" xmlns:w15="http://schemas.microsoft.com/office/word/2012/wordml" xmlns:w16cex="http://schemas.microsoft.com/office/word/2018/wordml/cex" xmlns:w16cid="http://schemas.microsoft.com/office/word/2016/wordml/cid" xmlns:w16="http://schemas.microsoft.com/office/word/2018/wordml" xmlns:w16du="http://schemas.microsoft.com/office/word/2023/wordml/word16du" xmlns:w16sdtdh="http://schemas.microsoft.com/office/word/2020/wordml/sdtdatahash" xmlns:w16sdtfl="http://schemas.microsoft.com/office/word/2024/wordml/sdtformatlock" xmlns:w16se="http://schemas.microsoft.com/office/word/2015/wordml/symex" xmlns:wpg="http://schemas.microsoft.com/office/word/2010/wordprocessingGroup" xmlns:wpi="http://schemas.microsoft.com/office/word/2010/wordprocessingInk" xmlns:wne="http://schemas.microsoft.com/office/word/2006/wordml" xmlns:wps="http://schemas.microsoft.com/office/word/2010/wordprocessingShape" mc:Ignorable="w14 w15 w16se w16cid w16 w16cex w16sdtdh w16sdtfl w16du wp14">
+<w:document xmlns:wpc="http://schemas.microsoft.com/office/word/2010/wordprocessingCanvas" xmlns:cx="http://schemas.microsoft.com/office/drawing/2014/chartex" xmlns:cx1="http://schemas.microsoft.com/office/drawing/2015/9/8/chartex" xmlns:cx2="http://schemas.microsoft.com/office/drawing/2015/10/21/chartex" xmlns:cx3="http://schemas.microsoft.com/office/drawing/2016/5/9/chartex" xmlns:cx4="http://schemas.microsoft.com/office/drawing/2016/5/10/chartex" xmlns:cx5="http://schemas.microsoft.com/office/drawing/2016/5/11/chartex" xmlns:cx6="http://schemas.microsoft.com/office/drawing/2016/5/12/chartex" xmlns:cx7="http://schemas.microsoft.com/office/drawing/2016/5/13/chartex" xmlns:cx8="http://schemas.microsoft.com/office/drawing/2016/5/14/chartex" xmlns:mc="http://schemas.openxmlformats.org/markup-compatibility/2006" xmlns:aink="http://schemas.microsoft.com/office/drawing/2016/ink" xmlns:am3d="http://schemas.microsoft.com/office/drawing/2017/model3d" xmlns:o="urn:schemas-microsoft-com:office:office" xmlns:oel="http://schemas.microsoft.com/office/2019/extlst" xmlns:r="http://schemas.openxmlformats.org/officeDocument/2006/relationships" xmlns:m="http://schemas.openxmlformats.org/officeDocument/2006/math" xmlns:v="urn:schemas-microsoft-com:vml" xmlns:wp14="http://schemas.microsoft.com/office/word/2010/wordprocessingDrawing" xmlns:wp="http://schemas.openxmlformats.org/drawingml/2006/wordprocessingDrawing" xmlns:w10="urn:schemas-microsoft-com:office:word" xmlns:w="http://schemas.openxmlformats.org/wordprocessingml/2006/main" xmlns:w14="http://schemas.microsoft.com/office/word/2010/wordml" xmlns:w15="http://schemas.microsoft.com/office/word/2012/wordml" xmlns:w16cei="http://schemas.microsoft.com/office/word/2026/wordml/cei" xmlns:w16cex="http://schemas.microsoft.com/office/word/2018/wordml/cex" xmlns:w16cid="http://schemas.microsoft.com/office/word/2016/wordml/cid" xmlns:w16="http://schemas.microsoft.com/office/word/2018/wordml" xmlns:w16du="http://schemas.microsoft.com/office/word/2023/wordml/word16du" xmlns:w16sdtdh="http://schemas.microsoft.com/office/word/2020/wordml/sdtdatahash" xmlns:w16sdtfl="http://schemas.microsoft.com/office/word/2024/wordml/sdtformatlock" xmlns:w16se="http://schemas.microsoft.com/office/word/2015/wordml/symex" xmlns:wpg="http://schemas.microsoft.com/office/word/2010/wordprocessingGroup" xmlns:wpi="http://schemas.microsoft.com/office/word/2010/wordprocessingInk" xmlns:wne="http://schemas.microsoft.com/office/word/2006/wordml" xmlns:wps="http://schemas.microsoft.com/office/word/2010/wordprocessingShape" mc:Ignorable="w14 w15 w16se w16cid w16 w16cex w16sdtdh w16sdtfl w16du wp14">
   <w:body>
     <w:p>
       <w:pPr>
@@ -41,21 +41,12 @@
       <w:r>
         <w:t xml:space="preserve"> the directory should contain an </w:t>
       </w:r>
-      <w:proofErr w:type="spellStart"/>
       <w:r>
         <w:rPr>
           <w:i/>
           <w:iCs/>
         </w:rPr>
-        <w:t>img</w:t>
-      </w:r>
-      <w:proofErr w:type="spellEnd"/>
-      <w:r>
-        <w:rPr>
-          <w:i/>
-          <w:iCs/>
-        </w:rPr>
-        <w:t xml:space="preserve"> </w:t>
+        <w:t xml:space="preserve">img </w:t>
       </w:r>
       <w:r>
         <w:t xml:space="preserve">folder with a </w:t>
@@ -298,7 +289,13 @@
         <w:t xml:space="preserve"> you then input the metals analyzed and their respective digestion method.</w:t>
       </w:r>
       <w:r>
-        <w:t xml:space="preserve"> I’ve attached a sample request report to walkthrough building a workbook.</w:t>
+        <w:t xml:space="preserve"> I’ve attached a sample request report to walk</w:t>
+      </w:r>
+      <w:r>
+        <w:t xml:space="preserve"> </w:t>
+      </w:r>
+      <w:r>
+        <w:t>through building a workbook.</w:t>
       </w:r>
     </w:p>
     <w:p>
@@ -476,23 +473,7 @@
           <w:i/>
           <w:iCs/>
         </w:rPr>
-        <w:t>shortcut=</w:t>
-      </w:r>
-      <w:proofErr w:type="spellStart"/>
-      <w:r>
-        <w:rPr>
-          <w:i/>
-          <w:iCs/>
-        </w:rPr>
-        <w:t>leading_sample_id</w:t>
-      </w:r>
-      <w:proofErr w:type="spellEnd"/>
-      <w:r>
-        <w:rPr>
-          <w:i/>
-          <w:iCs/>
-        </w:rPr>
-        <w:t>(n)</w:t>
+        <w:t>shortcut=leading_sample_id(n)</w:t>
       </w:r>
       <w:r>
         <w:t>, so in our case: 200127533(4) = 200127533, 200127534, 200127535, 200127536.</w:t>
@@ -650,15 +631,7 @@
         </w:tabs>
       </w:pPr>
       <w:r>
-        <w:t xml:space="preserve">Note the separate Ti </w:t>
-      </w:r>
-      <w:proofErr w:type="spellStart"/>
-      <w:r>
-        <w:t>Katanax</w:t>
-      </w:r>
-      <w:proofErr w:type="spellEnd"/>
-      <w:r>
-        <w:t xml:space="preserve"> digestion to capture Ti for sample </w:t>
+        <w:t xml:space="preserve">Note the separate Ti Katanax digestion to capture Ti for sample </w:t>
       </w:r>
       <w:r>
         <w:t>200127536;</w:t>
@@ -678,13 +651,8 @@
       <w:r>
         <w:t xml:space="preserve">for the Al, Ca </w:t>
       </w:r>
-      <w:proofErr w:type="spellStart"/>
-      <w:r>
-        <w:t>Katanax</w:t>
-      </w:r>
-      <w:proofErr w:type="spellEnd"/>
-      <w:r>
-        <w:t xml:space="preserve"> digestion.</w:t>
+      <w:r>
+        <w:t>Katanax digestion.</w:t>
       </w:r>
       <w:r>
         <w:t xml:space="preserve"> Once all the pertinent info is put into the </w:t>
@@ -1258,7 +1226,13 @@
     </w:p>
     <w:p>
       <w:r>
-        <w:t>The software will pull the correct lot data from</w:t>
+        <w:t>The software will</w:t>
+      </w:r>
+      <w:r>
+        <w:t xml:space="preserve"> extract</w:t>
+      </w:r>
+      <w:r>
+        <w:t xml:space="preserve"> the correct lot data from</w:t>
       </w:r>
       <w:r>
         <w:t xml:space="preserve"> </w:t>
@@ -1282,13 +1256,8 @@
       <w:r>
         <w:t xml:space="preserve">. Note the yellow unfilled </w:t>
       </w:r>
-      <w:proofErr w:type="spellStart"/>
-      <w:r>
-        <w:t>ti</w:t>
-      </w:r>
-      <w:proofErr w:type="spellEnd"/>
-      <w:r>
-        <w:t xml:space="preserve"> lot box implies that either the </w:t>
+      <w:r>
+        <w:t xml:space="preserve">ti lot box implies that either the </w:t>
       </w:r>
       <w:r>
         <w:rPr>
@@ -1298,15 +1267,7 @@
         <w:t>lot.csv</w:t>
       </w:r>
       <w:r>
-        <w:t xml:space="preserve"> does not contain a </w:t>
-      </w:r>
-      <w:proofErr w:type="spellStart"/>
-      <w:r>
-        <w:t>ti</w:t>
-      </w:r>
-      <w:proofErr w:type="spellEnd"/>
-      <w:r>
-        <w:t xml:space="preserve"> entry or that is expired.</w:t>
+        <w:t xml:space="preserve"> does not contain a ti entry or that is expired.</w:t>
       </w:r>
     </w:p>
     <w:p>
@@ -2489,15 +2450,7 @@
         <w:t xml:space="preserve"> file is maintained as a csv file that can be open with a text editor or excel.</w:t>
       </w:r>
       <w:r>
-        <w:t xml:space="preserve"> Expiration dates should be formatted as such: Month date </w:t>
-      </w:r>
-      <w:proofErr w:type="spellStart"/>
-      <w:r>
-        <w:t>yyyy</w:t>
-      </w:r>
-      <w:proofErr w:type="spellEnd"/>
-      <w:r>
-        <w:t>, month can be full form or abbreviated.</w:t>
+        <w:t xml:space="preserve"> Expiration dates should be formatted as such: Month date yyyy, month can be full form or abbreviated.</w:t>
       </w:r>
     </w:p>
     <w:p>
@@ -2677,31 +2630,7 @@
     </w:p>
     <w:p>
       <w:r>
-        <w:t>D</w:t>
-      </w:r>
-      <w:r>
-        <w:t>ouble-clicking</w:t>
-      </w:r>
-      <w:r>
-        <w:t xml:space="preserve"> in the Request ID autofill 1000 as an entry and d</w:t>
-      </w:r>
-      <w:r>
-        <w:t xml:space="preserve">ouble-clicking in the </w:t>
-      </w:r>
-      <w:r>
-        <w:t>Sample(s)</w:t>
-      </w:r>
-      <w:r>
-        <w:t xml:space="preserve"> autofill </w:t>
-      </w:r>
-      <w:r>
-        <w:t>20012</w:t>
-      </w:r>
-      <w:r>
-        <w:t xml:space="preserve"> as an entry</w:t>
-      </w:r>
-      <w:r>
-        <w:t xml:space="preserve">, </w:t>
+        <w:t xml:space="preserve">Double-clicking in the Request ID autofill 1000 as an entry and double-clicking in the Sample(s) autofill 20012 as an entry, </w:t>
       </w:r>
       <w:r>
         <w:t>both</w:t>
@@ -2783,7 +2712,7 @@
 </file>
 
 <file path=word/endnotes.xml><?xml version="1.0" encoding="utf-8"?>
-<w:endnotes xmlns:wpc="http://schemas.microsoft.com/office/word/2010/wordprocessingCanvas" xmlns:cx="http://schemas.microsoft.com/office/drawing/2014/chartex" xmlns:cx1="http://schemas.microsoft.com/office/drawing/2015/9/8/chartex" xmlns:cx2="http://schemas.microsoft.com/office/drawing/2015/10/21/chartex" xmlns:cx3="http://schemas.microsoft.com/office/drawing/2016/5/9/chartex" xmlns:cx4="http://schemas.microsoft.com/office/drawing/2016/5/10/chartex" xmlns:cx5="http://schemas.microsoft.com/office/drawing/2016/5/11/chartex" xmlns:cx6="http://schemas.microsoft.com/office/drawing/2016/5/12/chartex" xmlns:cx7="http://schemas.microsoft.com/office/drawing/2016/5/13/chartex" xmlns:cx8="http://schemas.microsoft.com/office/drawing/2016/5/14/chartex" xmlns:mc="http://schemas.openxmlformats.org/markup-compatibility/2006" xmlns:aink="http://schemas.microsoft.com/office/drawing/2016/ink" xmlns:am3d="http://schemas.microsoft.com/office/drawing/2017/model3d" xmlns:o="urn:schemas-microsoft-com:office:office" xmlns:oel="http://schemas.microsoft.com/office/2019/extlst" xmlns:r="http://schemas.openxmlformats.org/officeDocument/2006/relationships" xmlns:m="http://schemas.openxmlformats.org/officeDocument/2006/math" xmlns:v="urn:schemas-microsoft-com:vml" xmlns:wp14="http://schemas.microsoft.com/office/word/2010/wordprocessingDrawing" xmlns:wp="http://schemas.openxmlformats.org/drawingml/2006/wordprocessingDrawing" xmlns:w10="urn:schemas-microsoft-com:office:word" xmlns:w="http://schemas.openxmlformats.org/wordprocessingml/2006/main" xmlns:w14="http://schemas.microsoft.com/office/word/2010/wordml" xmlns:w15="http://schemas.microsoft.com/office/word/2012/wordml" xmlns:w16cex="http://schemas.microsoft.com/office/word/2018/wordml/cex" xmlns:w16cid="http://schemas.microsoft.com/office/word/2016/wordml/cid" xmlns:w16="http://schemas.microsoft.com/office/word/2018/wordml" xmlns:w16du="http://schemas.microsoft.com/office/word/2023/wordml/word16du" xmlns:w16sdtdh="http://schemas.microsoft.com/office/word/2020/wordml/sdtdatahash" xmlns:w16sdtfl="http://schemas.microsoft.com/office/word/2024/wordml/sdtformatlock" xmlns:w16se="http://schemas.microsoft.com/office/word/2015/wordml/symex" xmlns:wpg="http://schemas.microsoft.com/office/word/2010/wordprocessingGroup" xmlns:wpi="http://schemas.microsoft.com/office/word/2010/wordprocessingInk" xmlns:wne="http://schemas.microsoft.com/office/word/2006/wordml" xmlns:wps="http://schemas.microsoft.com/office/word/2010/wordprocessingShape" mc:Ignorable="w14 w15 w16se w16cid w16 w16cex w16sdtdh w16sdtfl w16du wp14">
+<w:endnotes xmlns:wpc="http://schemas.microsoft.com/office/word/2010/wordprocessingCanvas" xmlns:cx="http://schemas.microsoft.com/office/drawing/2014/chartex" xmlns:cx1="http://schemas.microsoft.com/office/drawing/2015/9/8/chartex" xmlns:cx2="http://schemas.microsoft.com/office/drawing/2015/10/21/chartex" xmlns:cx3="http://schemas.microsoft.com/office/drawing/2016/5/9/chartex" xmlns:cx4="http://schemas.microsoft.com/office/drawing/2016/5/10/chartex" xmlns:cx5="http://schemas.microsoft.com/office/drawing/2016/5/11/chartex" xmlns:cx6="http://schemas.microsoft.com/office/drawing/2016/5/12/chartex" xmlns:cx7="http://schemas.microsoft.com/office/drawing/2016/5/13/chartex" xmlns:cx8="http://schemas.microsoft.com/office/drawing/2016/5/14/chartex" xmlns:mc="http://schemas.openxmlformats.org/markup-compatibility/2006" xmlns:aink="http://schemas.microsoft.com/office/drawing/2016/ink" xmlns:am3d="http://schemas.microsoft.com/office/drawing/2017/model3d" xmlns:o="urn:schemas-microsoft-com:office:office" xmlns:oel="http://schemas.microsoft.com/office/2019/extlst" xmlns:r="http://schemas.openxmlformats.org/officeDocument/2006/relationships" xmlns:m="http://schemas.openxmlformats.org/officeDocument/2006/math" xmlns:v="urn:schemas-microsoft-com:vml" xmlns:wp14="http://schemas.microsoft.com/office/word/2010/wordprocessingDrawing" xmlns:wp="http://schemas.openxmlformats.org/drawingml/2006/wordprocessingDrawing" xmlns:w10="urn:schemas-microsoft-com:office:word" xmlns:w="http://schemas.openxmlformats.org/wordprocessingml/2006/main" xmlns:w14="http://schemas.microsoft.com/office/word/2010/wordml" xmlns:w15="http://schemas.microsoft.com/office/word/2012/wordml" xmlns:w16cei="http://schemas.microsoft.com/office/word/2026/wordml/cei" xmlns:w16cex="http://schemas.microsoft.com/office/word/2018/wordml/cex" xmlns:w16cid="http://schemas.microsoft.com/office/word/2016/wordml/cid" xmlns:w16="http://schemas.microsoft.com/office/word/2018/wordml" xmlns:w16du="http://schemas.microsoft.com/office/word/2023/wordml/word16du" xmlns:w16sdtdh="http://schemas.microsoft.com/office/word/2020/wordml/sdtdatahash" xmlns:w16sdtfl="http://schemas.microsoft.com/office/word/2024/wordml/sdtformatlock" xmlns:w16se="http://schemas.microsoft.com/office/word/2015/wordml/symex" xmlns:wpg="http://schemas.microsoft.com/office/word/2010/wordprocessingGroup" xmlns:wpi="http://schemas.microsoft.com/office/word/2010/wordprocessingInk" xmlns:wne="http://schemas.microsoft.com/office/word/2006/wordml" xmlns:wps="http://schemas.microsoft.com/office/word/2010/wordprocessingShape" mc:Ignorable="w14 w15 w16se w16cid w16 w16cex w16sdtdh w16sdtfl w16du wp14">
   <w:endnote w:type="separator" w:id="-1">
     <w:p>
       <w:pPr>
@@ -2808,7 +2737,7 @@
 </file>
 
 <file path=word/footnotes.xml><?xml version="1.0" encoding="utf-8"?>
-<w:footnotes xmlns:wpc="http://schemas.microsoft.com/office/word/2010/wordprocessingCanvas" xmlns:cx="http://schemas.microsoft.com/office/drawing/2014/chartex" xmlns:cx1="http://schemas.microsoft.com/office/drawing/2015/9/8/chartex" xmlns:cx2="http://schemas.microsoft.com/office/drawing/2015/10/21/chartex" xmlns:cx3="http://schemas.microsoft.com/office/drawing/2016/5/9/chartex" xmlns:cx4="http://schemas.microsoft.com/office/drawing/2016/5/10/chartex" xmlns:cx5="http://schemas.microsoft.com/office/drawing/2016/5/11/chartex" xmlns:cx6="http://schemas.microsoft.com/office/drawing/2016/5/12/chartex" xmlns:cx7="http://schemas.microsoft.com/office/drawing/2016/5/13/chartex" xmlns:cx8="http://schemas.microsoft.com/office/drawing/2016/5/14/chartex" xmlns:mc="http://schemas.openxmlformats.org/markup-compatibility/2006" xmlns:aink="http://schemas.microsoft.com/office/drawing/2016/ink" xmlns:am3d="http://schemas.microsoft.com/office/drawing/2017/model3d" xmlns:o="urn:schemas-microsoft-com:office:office" xmlns:oel="http://schemas.microsoft.com/office/2019/extlst" xmlns:r="http://schemas.openxmlformats.org/officeDocument/2006/relationships" xmlns:m="http://schemas.openxmlformats.org/officeDocument/2006/math" xmlns:v="urn:schemas-microsoft-com:vml" xmlns:wp14="http://schemas.microsoft.com/office/word/2010/wordprocessingDrawing" xmlns:wp="http://schemas.openxmlformats.org/drawingml/2006/wordprocessingDrawing" xmlns:w10="urn:schemas-microsoft-com:office:word" xmlns:w="http://schemas.openxmlformats.org/wordprocessingml/2006/main" xmlns:w14="http://schemas.microsoft.com/office/word/2010/wordml" xmlns:w15="http://schemas.microsoft.com/office/word/2012/wordml" xmlns:w16cex="http://schemas.microsoft.com/office/word/2018/wordml/cex" xmlns:w16cid="http://schemas.microsoft.com/office/word/2016/wordml/cid" xmlns:w16="http://schemas.microsoft.com/office/word/2018/wordml" xmlns:w16du="http://schemas.microsoft.com/office/word/2023/wordml/word16du" xmlns:w16sdtdh="http://schemas.microsoft.com/office/word/2020/wordml/sdtdatahash" xmlns:w16sdtfl="http://schemas.microsoft.com/office/word/2024/wordml/sdtformatlock" xmlns:w16se="http://schemas.microsoft.com/office/word/2015/wordml/symex" xmlns:wpg="http://schemas.microsoft.com/office/word/2010/wordprocessingGroup" xmlns:wpi="http://schemas.microsoft.com/office/word/2010/wordprocessingInk" xmlns:wne="http://schemas.microsoft.com/office/word/2006/wordml" xmlns:wps="http://schemas.microsoft.com/office/word/2010/wordprocessingShape" mc:Ignorable="w14 w15 w16se w16cid w16 w16cex w16sdtdh w16sdtfl w16du wp14">
+<w:footnotes xmlns:wpc="http://schemas.microsoft.com/office/word/2010/wordprocessingCanvas" xmlns:cx="http://schemas.microsoft.com/office/drawing/2014/chartex" xmlns:cx1="http://schemas.microsoft.com/office/drawing/2015/9/8/chartex" xmlns:cx2="http://schemas.microsoft.com/office/drawing/2015/10/21/chartex" xmlns:cx3="http://schemas.microsoft.com/office/drawing/2016/5/9/chartex" xmlns:cx4="http://schemas.microsoft.com/office/drawing/2016/5/10/chartex" xmlns:cx5="http://schemas.microsoft.com/office/drawing/2016/5/11/chartex" xmlns:cx6="http://schemas.microsoft.com/office/drawing/2016/5/12/chartex" xmlns:cx7="http://schemas.microsoft.com/office/drawing/2016/5/13/chartex" xmlns:cx8="http://schemas.microsoft.com/office/drawing/2016/5/14/chartex" xmlns:mc="http://schemas.openxmlformats.org/markup-compatibility/2006" xmlns:aink="http://schemas.microsoft.com/office/drawing/2016/ink" xmlns:am3d="http://schemas.microsoft.com/office/drawing/2017/model3d" xmlns:o="urn:schemas-microsoft-com:office:office" xmlns:oel="http://schemas.microsoft.com/office/2019/extlst" xmlns:r="http://schemas.openxmlformats.org/officeDocument/2006/relationships" xmlns:m="http://schemas.openxmlformats.org/officeDocument/2006/math" xmlns:v="urn:schemas-microsoft-com:vml" xmlns:wp14="http://schemas.microsoft.com/office/word/2010/wordprocessingDrawing" xmlns:wp="http://schemas.openxmlformats.org/drawingml/2006/wordprocessingDrawing" xmlns:w10="urn:schemas-microsoft-com:office:word" xmlns:w="http://schemas.openxmlformats.org/wordprocessingml/2006/main" xmlns:w14="http://schemas.microsoft.com/office/word/2010/wordml" xmlns:w15="http://schemas.microsoft.com/office/word/2012/wordml" xmlns:w16cei="http://schemas.microsoft.com/office/word/2026/wordml/cei" xmlns:w16cex="http://schemas.microsoft.com/office/word/2018/wordml/cex" xmlns:w16cid="http://schemas.microsoft.com/office/word/2016/wordml/cid" xmlns:w16="http://schemas.microsoft.com/office/word/2018/wordml" xmlns:w16du="http://schemas.microsoft.com/office/word/2023/wordml/word16du" xmlns:w16sdtdh="http://schemas.microsoft.com/office/word/2020/wordml/sdtdatahash" xmlns:w16sdtfl="http://schemas.microsoft.com/office/word/2024/wordml/sdtformatlock" xmlns:w16se="http://schemas.microsoft.com/office/word/2015/wordml/symex" xmlns:wpg="http://schemas.microsoft.com/office/word/2010/wordprocessingGroup" xmlns:wpi="http://schemas.microsoft.com/office/word/2010/wordprocessingInk" xmlns:wne="http://schemas.microsoft.com/office/word/2006/wordml" xmlns:wps="http://schemas.microsoft.com/office/word/2010/wordprocessingShape" mc:Ignorable="w14 w15 w16se w16cid w16 w16cex w16sdtdh w16sdtfl w16du wp14">
   <w:footnote w:type="separator" w:id="-1">
     <w:p>
       <w:pPr>
@@ -2833,7 +2762,7 @@
 </file>
 
 <file path=word/header1.xml><?xml version="1.0" encoding="utf-8"?>
-<w:hdr xmlns:wpc="http://schemas.microsoft.com/office/word/2010/wordprocessingCanvas" xmlns:cx="http://schemas.microsoft.com/office/drawing/2014/chartex" xmlns:cx1="http://schemas.microsoft.com/office/drawing/2015/9/8/chartex" xmlns:cx2="http://schemas.microsoft.com/office/drawing/2015/10/21/chartex" xmlns:cx3="http://schemas.microsoft.com/office/drawing/2016/5/9/chartex" xmlns:cx4="http://schemas.microsoft.com/office/drawing/2016/5/10/chartex" xmlns:cx5="http://schemas.microsoft.com/office/drawing/2016/5/11/chartex" xmlns:cx6="http://schemas.microsoft.com/office/drawing/2016/5/12/chartex" xmlns:cx7="http://schemas.microsoft.com/office/drawing/2016/5/13/chartex" xmlns:cx8="http://schemas.microsoft.com/office/drawing/2016/5/14/chartex" xmlns:mc="http://schemas.openxmlformats.org/markup-compatibility/2006" xmlns:aink="http://schemas.microsoft.com/office/drawing/2016/ink" xmlns:am3d="http://schemas.microsoft.com/office/drawing/2017/model3d" xmlns:o="urn:schemas-microsoft-com:office:office" xmlns:oel="http://schemas.microsoft.com/office/2019/extlst" xmlns:r="http://schemas.openxmlformats.org/officeDocument/2006/relationships" xmlns:m="http://schemas.openxmlformats.org/officeDocument/2006/math" xmlns:v="urn:schemas-microsoft-com:vml" xmlns:wp14="http://schemas.microsoft.com/office/word/2010/wordprocessingDrawing" xmlns:wp="http://schemas.openxmlformats.org/drawingml/2006/wordprocessingDrawing" xmlns:w10="urn:schemas-microsoft-com:office:word" xmlns:w="http://schemas.openxmlformats.org/wordprocessingml/2006/main" xmlns:w14="http://schemas.microsoft.com/office/word/2010/wordml" xmlns:w15="http://schemas.microsoft.com/office/word/2012/wordml" xmlns:w16cex="http://schemas.microsoft.com/office/word/2018/wordml/cex" xmlns:w16cid="http://schemas.microsoft.com/office/word/2016/wordml/cid" xmlns:w16="http://schemas.microsoft.com/office/word/2018/wordml" xmlns:w16du="http://schemas.microsoft.com/office/word/2023/wordml/word16du" xmlns:w16sdtdh="http://schemas.microsoft.com/office/word/2020/wordml/sdtdatahash" xmlns:w16sdtfl="http://schemas.microsoft.com/office/word/2024/wordml/sdtformatlock" xmlns:w16se="http://schemas.microsoft.com/office/word/2015/wordml/symex" xmlns:wpg="http://schemas.microsoft.com/office/word/2010/wordprocessingGroup" xmlns:wpi="http://schemas.microsoft.com/office/word/2010/wordprocessingInk" xmlns:wne="http://schemas.microsoft.com/office/word/2006/wordml" xmlns:wps="http://schemas.microsoft.com/office/word/2010/wordprocessingShape" mc:Ignorable="w14 w15 w16se w16cid w16 w16cex w16sdtdh w16sdtfl w16du wp14">
+<w:hdr xmlns:wpc="http://schemas.microsoft.com/office/word/2010/wordprocessingCanvas" xmlns:cx="http://schemas.microsoft.com/office/drawing/2014/chartex" xmlns:cx1="http://schemas.microsoft.com/office/drawing/2015/9/8/chartex" xmlns:cx2="http://schemas.microsoft.com/office/drawing/2015/10/21/chartex" xmlns:cx3="http://schemas.microsoft.com/office/drawing/2016/5/9/chartex" xmlns:cx4="http://schemas.microsoft.com/office/drawing/2016/5/10/chartex" xmlns:cx5="http://schemas.microsoft.com/office/drawing/2016/5/11/chartex" xmlns:cx6="http://schemas.microsoft.com/office/drawing/2016/5/12/chartex" xmlns:cx7="http://schemas.microsoft.com/office/drawing/2016/5/13/chartex" xmlns:cx8="http://schemas.microsoft.com/office/drawing/2016/5/14/chartex" xmlns:mc="http://schemas.openxmlformats.org/markup-compatibility/2006" xmlns:aink="http://schemas.microsoft.com/office/drawing/2016/ink" xmlns:am3d="http://schemas.microsoft.com/office/drawing/2017/model3d" xmlns:o="urn:schemas-microsoft-com:office:office" xmlns:oel="http://schemas.microsoft.com/office/2019/extlst" xmlns:r="http://schemas.openxmlformats.org/officeDocument/2006/relationships" xmlns:m="http://schemas.openxmlformats.org/officeDocument/2006/math" xmlns:v="urn:schemas-microsoft-com:vml" xmlns:wp14="http://schemas.microsoft.com/office/word/2010/wordprocessingDrawing" xmlns:wp="http://schemas.openxmlformats.org/drawingml/2006/wordprocessingDrawing" xmlns:w10="urn:schemas-microsoft-com:office:word" xmlns:w="http://schemas.openxmlformats.org/wordprocessingml/2006/main" xmlns:w14="http://schemas.microsoft.com/office/word/2010/wordml" xmlns:w15="http://schemas.microsoft.com/office/word/2012/wordml" xmlns:w16cei="http://schemas.microsoft.com/office/word/2026/wordml/cei" xmlns:w16cex="http://schemas.microsoft.com/office/word/2018/wordml/cex" xmlns:w16cid="http://schemas.microsoft.com/office/word/2016/wordml/cid" xmlns:w16="http://schemas.microsoft.com/office/word/2018/wordml" xmlns:w16du="http://schemas.microsoft.com/office/word/2023/wordml/word16du" xmlns:w16sdtdh="http://schemas.microsoft.com/office/word/2020/wordml/sdtdatahash" xmlns:w16sdtfl="http://schemas.microsoft.com/office/word/2024/wordml/sdtformatlock" xmlns:w16se="http://schemas.microsoft.com/office/word/2015/wordml/symex" xmlns:wpg="http://schemas.microsoft.com/office/word/2010/wordprocessingGroup" xmlns:wpi="http://schemas.microsoft.com/office/word/2010/wordprocessingInk" xmlns:wne="http://schemas.microsoft.com/office/word/2006/wordml" xmlns:wps="http://schemas.microsoft.com/office/word/2010/wordprocessingShape" mc:Ignorable="w14 w15 w16se w16cid w16 w16cex w16sdtdh w16sdtfl w16du wp14">
   <w:p>
     <w:pPr>
       <w:pStyle w:val="Header"/>
@@ -3460,6 +3389,7 @@
   <w:style w:type="character" w:default="1" w:styleId="DefaultParagraphFont">
     <w:name w:val="Default Paragraph Font"/>
     <w:uiPriority w:val="1"/>
+    <w:semiHidden/>
     <w:unhideWhenUsed/>
   </w:style>
   <w:style w:type="table" w:default="1" w:styleId="TableNormal">
@@ -4185,14 +4115,12 @@
 </file>
 
 <file path=customXml/item1.xml><?xml version="1.0" encoding="utf-8"?>
-<p:properties xmlns:p="http://schemas.microsoft.com/office/2006/metadata/properties" xmlns:xsi="http://www.w3.org/2001/XMLSchema-instance" xmlns:pc="http://schemas.microsoft.com/office/infopath/2007/PartnerControls">
-  <documentManagement>
-    <TaxCatchAll xmlns="0fc475c1-99c8-4a27-b640-1b405f183953" xsi:nil="true"/>
-    <lcf76f155ced4ddcb4097134ff3c332f xmlns="23ce4f88-cd98-46c7-a231-3c68dd29b0d7">
-      <Terms xmlns="http://schemas.microsoft.com/office/infopath/2007/PartnerControls"/>
-    </lcf76f155ced4ddcb4097134ff3c332f>
-  </documentManagement>
-</p:properties>
+<?mso-contentType ?>
+<FormTemplates xmlns="http://schemas.microsoft.com/sharepoint/v3/contenttype/forms">
+  <Display>DocumentLibraryForm</Display>
+  <Edit>DocumentLibraryForm</Edit>
+  <New>DocumentLibraryForm</New>
+</FormTemplates>
 </file>
 
 <file path=customXml/item2.xml><?xml version="1.0" encoding="utf-8"?>
@@ -4457,21 +4385,20 @@
 </file>
 
 <file path=customXml/item3.xml><?xml version="1.0" encoding="utf-8"?>
-<?mso-contentType ?>
-<FormTemplates xmlns="http://schemas.microsoft.com/sharepoint/v3/contenttype/forms">
-  <Display>DocumentLibraryForm</Display>
-  <Edit>DocumentLibraryForm</Edit>
-  <New>DocumentLibraryForm</New>
-</FormTemplates>
+<p:properties xmlns:p="http://schemas.microsoft.com/office/2006/metadata/properties" xmlns:xsi="http://www.w3.org/2001/XMLSchema-instance" xmlns:pc="http://schemas.microsoft.com/office/infopath/2007/PartnerControls">
+  <documentManagement>
+    <TaxCatchAll xmlns="0fc475c1-99c8-4a27-b640-1b405f183953" xsi:nil="true"/>
+    <lcf76f155ced4ddcb4097134ff3c332f xmlns="23ce4f88-cd98-46c7-a231-3c68dd29b0d7">
+      <Terms xmlns="http://schemas.microsoft.com/office/infopath/2007/PartnerControls"/>
+    </lcf76f155ced4ddcb4097134ff3c332f>
+  </documentManagement>
+</p:properties>
 </file>
 
 <file path=customXml/itemProps1.xml><?xml version="1.0" encoding="utf-8"?>
-<ds:datastoreItem xmlns:ds="http://schemas.openxmlformats.org/officeDocument/2006/customXml" ds:itemID="{439C65E3-FBD4-42DD-A22B-C05F66E5A302}">
+<ds:datastoreItem xmlns:ds="http://schemas.openxmlformats.org/officeDocument/2006/customXml" ds:itemID="{8D5B6878-469A-4B60-998B-9702BD32B9BE}">
   <ds:schemaRefs>
-    <ds:schemaRef ds:uri="http://schemas.microsoft.com/office/2006/metadata/properties"/>
-    <ds:schemaRef ds:uri="http://schemas.microsoft.com/office/infopath/2007/PartnerControls"/>
-    <ds:schemaRef ds:uri="0fc475c1-99c8-4a27-b640-1b405f183953"/>
-    <ds:schemaRef ds:uri="23ce4f88-cd98-46c7-a231-3c68dd29b0d7"/>
+    <ds:schemaRef ds:uri="http://schemas.microsoft.com/sharepoint/v3/contenttype/forms"/>
   </ds:schemaRefs>
 </ds:datastoreItem>
 </file>
@@ -4496,9 +4423,12 @@
 </file>
 
 <file path=customXml/itemProps3.xml><?xml version="1.0" encoding="utf-8"?>
-<ds:datastoreItem xmlns:ds="http://schemas.openxmlformats.org/officeDocument/2006/customXml" ds:itemID="{8D5B6878-469A-4B60-998B-9702BD32B9BE}">
+<ds:datastoreItem xmlns:ds="http://schemas.openxmlformats.org/officeDocument/2006/customXml" ds:itemID="{439C65E3-FBD4-42DD-A22B-C05F66E5A302}">
   <ds:schemaRefs>
-    <ds:schemaRef ds:uri="http://schemas.microsoft.com/sharepoint/v3/contenttype/forms"/>
+    <ds:schemaRef ds:uri="http://schemas.microsoft.com/office/2006/metadata/properties"/>
+    <ds:schemaRef ds:uri="http://schemas.microsoft.com/office/infopath/2007/PartnerControls"/>
+    <ds:schemaRef ds:uri="0fc475c1-99c8-4a27-b640-1b405f183953"/>
+    <ds:schemaRef ds:uri="23ce4f88-cd98-46c7-a231-3c68dd29b0d7"/>
   </ds:schemaRefs>
 </ds:datastoreItem>
 </file>
</xml_diff>